<commit_message>
Trim abstract to 150 words for Bioinformatics
</commit_message>
<xml_diff>
--- a/manuscript_final.docx
+++ b/manuscript_final.docx
@@ -2001,9 +2001,9 @@
       <w:r>
         <w:drawing>
           <wp:inline distT="0" distB="0" distL="114300" distR="114300">
-            <wp:extent cx="5334000" cy="2614930"/>
-            <wp:effectExtent l="0" t="0" r="0" b="0"/>
-            <wp:docPr id="43" name="Picture" descr="Figure 8: Ablation analysis."/>
+            <wp:extent cx="5334000" cy="2614295"/>
+            <wp:effectExtent l="0" t="0" r="0" b="5080"/>
+            <wp:docPr id="2" name="Picture" descr="Figure 8: Ablation analysis."/>
             <wp:cNvGraphicFramePr>
               <a:graphicFrameLocks xmlns:a="http://schemas.openxmlformats.org/drawingml/2006/main" noChangeAspect="1"/>
             </wp:cNvGraphicFramePr>
@@ -2011,7 +2011,7 @@
               <a:graphicData uri="http://schemas.openxmlformats.org/drawingml/2006/picture">
                 <pic:pic xmlns:pic="http://schemas.openxmlformats.org/drawingml/2006/picture">
                   <pic:nvPicPr>
-                    <pic:cNvPr id="43" name="Picture" descr="Figure 8: Ablation analysis."/>
+                    <pic:cNvPr id="2" name="Picture" descr="Figure 8: Ablation analysis."/>
                     <pic:cNvPicPr>
                       <a:picLocks noChangeAspect="1" noChangeArrowheads="1"/>
                     </pic:cNvPicPr>
@@ -2025,7 +2025,7 @@
                   <pic:spPr>
                     <a:xfrm>
                       <a:off x="0" y="0"/>
-                      <a:ext cx="5334000" cy="2615363"/>
+                      <a:ext cx="5334000" cy="2614731"/>
                     </a:xfrm>
                     <a:prstGeom prst="rect">
                       <a:avLst/>
@@ -2041,6 +2041,8 @@
           </wp:inline>
         </w:drawing>
       </w:r>
+      <w:bookmarkStart w:id="27" w:name="_GoBack"/>
+      <w:bookmarkEnd w:id="27"/>
     </w:p>
     <w:p>
       <w:pPr>
@@ -3776,8 +3778,6 @@
       <w:r>
         <w:t>LDT-TargetDB addresses a recognized gap in computational covalent drug discovery: the systematic prioritization of extracellular surface targets based on structural and chemical compatibility with covalent warhead chemistry. By integrating expression, extracellular accessibility, 3D pocket geometry, and nucleophile reactivity scoring within a unified computational framework, LDT-TargetDB generates experimentally testable target hypotheses for covalent radiopharmaceutical development.</w:t>
       </w:r>
-      <w:bookmarkStart w:id="27" w:name="_GoBack"/>
-      <w:bookmarkEnd w:id="27"/>
     </w:p>
     <w:p>
       <w:pPr>
@@ -5058,7 +5058,7 @@
     <w:lsdException w:unhideWhenUsed="0" w:uiPriority="0" w:semiHidden="0" w:name="HTML Sample"/>
     <w:lsdException w:unhideWhenUsed="0" w:uiPriority="0" w:semiHidden="0" w:name="HTML Typewriter"/>
     <w:lsdException w:unhideWhenUsed="0" w:uiPriority="0" w:semiHidden="0" w:name="HTML Variable"/>
-    <w:lsdException w:unhideWhenUsed="0" w:uiPriority="0" w:semiHidden="0" w:name="Normal Table"/>
+    <w:lsdException w:qFormat="1" w:unhideWhenUsed="0" w:uiPriority="0" w:semiHidden="0" w:name="Normal Table"/>
     <w:lsdException w:unhideWhenUsed="0" w:uiPriority="0" w:semiHidden="0" w:name="annotation subject"/>
     <w:lsdException w:unhideWhenUsed="0" w:uiPriority="0" w:semiHidden="0" w:name="Table Simple 1"/>
     <w:lsdException w:unhideWhenUsed="0" w:uiPriority="0" w:semiHidden="0" w:name="Table Simple 2"/>
@@ -5417,6 +5417,7 @@
   </w:style>
   <w:style w:type="table" w:default="1" w:styleId="18">
     <w:name w:val="Normal Table"/>
+    <w:qFormat/>
     <w:uiPriority w:val="0"/>
     <w:tblPr>
       <w:tblCellMar>
@@ -5572,6 +5573,7 @@
     <w:name w:val="Subtitle Char"/>
     <w:basedOn w:val="19"/>
     <w:link w:val="16"/>
+    <w:qFormat/>
     <w:uiPriority w:val="11"/>
     <w:rPr>
       <w:rFonts w:eastAsiaTheme="majorEastAsia" w:cstheme="majorBidi"/>

</xml_diff>